<commit_message>
Audit observation windows, interval coverage and research boundaries
</commit_message>
<xml_diff>
--- a/docs/cmapss/C-MAPSS展示阐述与VIVA说明.docx
+++ b/docs/cmapss/C-MAPSS展示阐述与VIVA说明.docx
@@ -20,7 +20,7 @@
     </w:p>
     <w:p>
       <w:r>
-        <w:t>版本 v0.7  |  2026年10月6日  |  配套英文网页展示</w:t>
+        <w:t>版本 v0.8  |  2026年10月6日  |  配套英文网页展示</w:t>
       </w:r>
     </w:p>
     <w:p>
@@ -385,7 +385,12 @@
     </w:p>
     <w:p>
       <w:r>
-        <w:t>第二至四页解释案例分工、九幕叙事及框架与本体协同；第五页给出定量证据和敏感性解释；第六页区分候选贡献与缺失验证；第七页提供操作顺序与答辩讲解；第八页列出常见追问及基础版本来源；第九至十二页记录第二轮修改、对照实验和再次审查结论。</w:t>
+        <w:t>最新补充见第十三至十五页：匹配窗口、区间上限诊断、语义压力测试、来源对照与外部验证方案。第十二页保留上一轮审查，最后一页给出本轮复审。</w:t>
+      </w:r>
+    </w:p>
+    <w:p>
+      <w:r>
+        <w:t>基础说明见第二至八页；第二轮实验与审查见第九至十二页。</w:t>
       </w:r>
     </w:p>
     <w:p>
@@ -8488,6 +8493,2164 @@
     <w:p>
       <w:r>
         <w:t>网页自动概览保留九幕；新增实验作为手动模式中的展开面板。答辩中应按追问选择证据，不必在三分钟内逐行解释全部表格。</w:t>
+      </w:r>
+    </w:p>
+    <w:p>
+      <w:r>
+        <w:br w:type="page"/>
+      </w:r>
+    </w:p>
+    <w:p>
+      <w:pPr>
+        <w:pStyle w:val="Heading1"/>
+      </w:pPr>
+      <w:r>
+        <w:t>12 匹配观察窗口与不确定性诊断</w:t>
+      </w:r>
+    </w:p>
+    <w:p>
+      <w:r>
+        <w:t>本轮新增回顾性完整记录对照，固定周期 30–120，保留每个周期均有记录的七台发动机，共 637 个快照。001 号只有两个可用周期，明确排除。窗口不是预注册方案；相同运行周期也不表示相同退化阶段。</w:t>
+      </w:r>
+    </w:p>
+    <w:tbl>
+      <w:tblPr>
+        <w:tblW w:type="auto" w:w="0"/>
+        <w:tblLayout w:type="fixed"/>
+        <w:tblLook w:firstColumn="1" w:firstRow="1" w:lastColumn="0" w:lastRow="0" w:noHBand="0" w:noVBand="1" w:val="04A0"/>
+      </w:tblPr>
+      <w:tblGrid>
+        <w:gridCol w:w="3402"/>
+        <w:gridCol w:w="3061"/>
+        <w:gridCol w:w="3061"/>
+      </w:tblGrid>
+      <w:tr>
+        <w:trPr>
+          <w:tblHeader/>
+          <w:cantSplit/>
+        </w:trPr>
+        <w:tc>
+          <w:tcPr>
+            <w:tcW w:type="dxa" w:w="3402"/>
+            <w:shd w:fill="E4EEE9"/>
+            <w:tcMar>
+              <w:top w:w="40" w:type="dxa"/>
+              <w:bottom w:w="40" w:type="dxa"/>
+              <w:left w:w="90" w:type="dxa"/>
+              <w:right w:w="90" w:type="dxa"/>
+            </w:tcMar>
+          </w:tcPr>
+          <w:p>
+            <w:pPr>
+              <w:spacing w:after="60" w:line="271" w:lineRule="auto"/>
+            </w:pPr>
+            <w:r>
+              <w:rPr>
+                <w:b/>
+                <w:sz w:val="18"/>
+              </w:rPr>
+              <w:t>availability assurance 情境</w:t>
+            </w:r>
+          </w:p>
+        </w:tc>
+        <w:tc>
+          <w:tcPr>
+            <w:tcW w:type="dxa" w:w="3061"/>
+            <w:shd w:fill="E4EEE9"/>
+            <w:tcMar>
+              <w:top w:w="40" w:type="dxa"/>
+              <w:bottom w:w="40" w:type="dxa"/>
+              <w:left w:w="90" w:type="dxa"/>
+              <w:right w:w="90" w:type="dxa"/>
+            </w:tcMar>
+          </w:tcPr>
+          <w:p>
+            <w:pPr>
+              <w:spacing w:after="60" w:line="271" w:lineRule="auto"/>
+            </w:pPr>
+            <w:r>
+              <w:rPr>
+                <w:b/>
+                <w:sz w:val="18"/>
+              </w:rPr>
+              <w:t>完整回放</w:t>
+            </w:r>
+          </w:p>
+        </w:tc>
+        <w:tc>
+          <w:tcPr>
+            <w:tcW w:type="dxa" w:w="3061"/>
+            <w:shd w:fill="E4EEE9"/>
+            <w:tcMar>
+              <w:top w:w="40" w:type="dxa"/>
+              <w:bottom w:w="40" w:type="dxa"/>
+              <w:left w:w="90" w:type="dxa"/>
+              <w:right w:w="90" w:type="dxa"/>
+            </w:tcMar>
+          </w:tcPr>
+          <w:p>
+            <w:pPr>
+              <w:spacing w:after="60" w:line="271" w:lineRule="auto"/>
+            </w:pPr>
+            <w:r>
+              <w:rPr>
+                <w:b/>
+                <w:sz w:val="18"/>
+              </w:rPr>
+              <w:t>固定周期 30–120</w:t>
+            </w:r>
+          </w:p>
+        </w:tc>
+      </w:tr>
+      <w:tr>
+        <w:trPr>
+          <w:cantSplit/>
+        </w:trPr>
+        <w:tc>
+          <w:tcPr>
+            <w:tcW w:type="dxa" w:w="3402"/>
+            <w:shd w:fill="F5F7F4"/>
+            <w:tcMar>
+              <w:top w:w="40" w:type="dxa"/>
+              <w:bottom w:w="40" w:type="dxa"/>
+              <w:left w:w="90" w:type="dxa"/>
+              <w:right w:w="90" w:type="dxa"/>
+            </w:tcMar>
+          </w:tcPr>
+          <w:p>
+            <w:pPr>
+              <w:spacing w:after="60" w:line="271" w:lineRule="auto"/>
+            </w:pPr>
+            <w:r>
+              <w:rPr>
+                <w:b w:val="0"/>
+                <w:sz w:val="18"/>
+              </w:rPr>
+              <w:t>观察范围</w:t>
+            </w:r>
+          </w:p>
+        </w:tc>
+        <w:tc>
+          <w:tcPr>
+            <w:tcW w:type="dxa" w:w="3061"/>
+            <w:shd w:fill="F5F7F4"/>
+            <w:tcMar>
+              <w:top w:w="40" w:type="dxa"/>
+              <w:bottom w:w="40" w:type="dxa"/>
+              <w:left w:w="90" w:type="dxa"/>
+              <w:right w:w="90" w:type="dxa"/>
+            </w:tcMar>
+          </w:tcPr>
+          <w:p>
+            <w:pPr>
+              <w:spacing w:after="60" w:line="271" w:lineRule="auto"/>
+            </w:pPr>
+            <w:r>
+              <w:rPr>
+                <w:b w:val="0"/>
+                <w:sz w:val="18"/>
+              </w:rPr>
+              <w:t>八台发动机 1,233 个快照</w:t>
+            </w:r>
+          </w:p>
+        </w:tc>
+        <w:tc>
+          <w:tcPr>
+            <w:tcW w:type="dxa" w:w="3061"/>
+            <w:shd w:fill="F5F7F4"/>
+            <w:tcMar>
+              <w:top w:w="40" w:type="dxa"/>
+              <w:bottom w:w="40" w:type="dxa"/>
+              <w:left w:w="90" w:type="dxa"/>
+              <w:right w:w="90" w:type="dxa"/>
+            </w:tcMar>
+          </w:tcPr>
+          <w:p>
+            <w:pPr>
+              <w:spacing w:after="60" w:line="271" w:lineRule="auto"/>
+            </w:pPr>
+            <w:r>
+              <w:rPr>
+                <w:b w:val="0"/>
+                <w:sz w:val="18"/>
+              </w:rPr>
+              <w:t>七台发动机 每台 91 个快照</w:t>
+            </w:r>
+          </w:p>
+        </w:tc>
+      </w:tr>
+      <w:tr>
+        <w:trPr>
+          <w:cantSplit/>
+        </w:trPr>
+        <w:tc>
+          <w:tcPr>
+            <w:tcW w:type="dxa" w:w="3402"/>
+            <w:shd w:fill="FFFFFF"/>
+            <w:tcMar>
+              <w:top w:w="40" w:type="dxa"/>
+              <w:bottom w:w="40" w:type="dxa"/>
+              <w:left w:w="90" w:type="dxa"/>
+              <w:right w:w="90" w:type="dxa"/>
+            </w:tcMar>
+          </w:tcPr>
+          <w:p>
+            <w:pPr>
+              <w:spacing w:after="60" w:line="271" w:lineRule="auto"/>
+            </w:pPr>
+            <w:r>
+              <w:rPr>
+                <w:b w:val="0"/>
+                <w:sz w:val="18"/>
+              </w:rPr>
+              <w:t>区间宽度 ×1.25 的建议变化</w:t>
+            </w:r>
+          </w:p>
+        </w:tc>
+        <w:tc>
+          <w:tcPr>
+            <w:tcW w:type="dxa" w:w="3061"/>
+            <w:shd w:fill="FFFFFF"/>
+            <w:tcMar>
+              <w:top w:w="40" w:type="dxa"/>
+              <w:bottom w:w="40" w:type="dxa"/>
+              <w:left w:w="90" w:type="dxa"/>
+              <w:right w:w="90" w:type="dxa"/>
+            </w:tcMar>
+          </w:tcPr>
+          <w:p>
+            <w:pPr>
+              <w:spacing w:after="60" w:line="271" w:lineRule="auto"/>
+            </w:pPr>
+            <w:r>
+              <w:rPr>
+                <w:b w:val="0"/>
+                <w:sz w:val="18"/>
+              </w:rPr>
+              <w:t>150 / 1,233 约 12.2%</w:t>
+            </w:r>
+          </w:p>
+        </w:tc>
+        <w:tc>
+          <w:tcPr>
+            <w:tcW w:type="dxa" w:w="3061"/>
+            <w:shd w:fill="FFFFFF"/>
+            <w:tcMar>
+              <w:top w:w="40" w:type="dxa"/>
+              <w:bottom w:w="40" w:type="dxa"/>
+              <w:left w:w="90" w:type="dxa"/>
+              <w:right w:w="90" w:type="dxa"/>
+            </w:tcMar>
+          </w:tcPr>
+          <w:p>
+            <w:pPr>
+              <w:spacing w:after="60" w:line="271" w:lineRule="auto"/>
+            </w:pPr>
+            <w:r>
+              <w:rPr>
+                <w:b w:val="0"/>
+                <w:sz w:val="18"/>
+              </w:rPr>
+              <w:t>4 / 637 约 0.6%</w:t>
+            </w:r>
+          </w:p>
+        </w:tc>
+      </w:tr>
+    </w:tbl>
+    <w:p>
+      <w:pPr>
+        <w:spacing w:after="0"/>
+      </w:pPr>
+    </w:p>
+    <w:p>
+      <w:r>
+        <w:t>该差异表明统计结果依赖观察范围。较早窗口省略后期退化，不能将其较低变化率解释为全寿命稳健性提升。完整回放和匹配窗口应并列呈现。</w:t>
+      </w:r>
+    </w:p>
+    <w:p>
+      <w:pPr>
+        <w:pStyle w:val="Heading2"/>
+      </w:pPr>
+      <w:r>
+        <w:t>区分风险评分与门槛资格</w:t>
+      </w:r>
+    </w:p>
+    <w:tbl>
+      <w:tblPr>
+        <w:tblW w:type="auto" w:w="0"/>
+        <w:tblLayout w:type="fixed"/>
+        <w:tblLook w:firstColumn="1" w:firstRow="1" w:lastColumn="0" w:lastRow="0" w:noHBand="0" w:noVBand="1" w:val="04A0"/>
+      </w:tblPr>
+      <w:tblGrid>
+        <w:gridCol w:w="3005"/>
+        <w:gridCol w:w="3231"/>
+        <w:gridCol w:w="3288"/>
+      </w:tblGrid>
+      <w:tr>
+        <w:trPr>
+          <w:tblHeader/>
+          <w:cantSplit/>
+        </w:trPr>
+        <w:tc>
+          <w:tcPr>
+            <w:tcW w:type="dxa" w:w="3005"/>
+            <w:shd w:fill="E4EEE9"/>
+            <w:tcMar>
+              <w:top w:w="40" w:type="dxa"/>
+              <w:bottom w:w="40" w:type="dxa"/>
+              <w:left w:w="90" w:type="dxa"/>
+              <w:right w:w="90" w:type="dxa"/>
+            </w:tcMar>
+          </w:tcPr>
+          <w:p>
+            <w:pPr>
+              <w:spacing w:after="60" w:line="271" w:lineRule="auto"/>
+            </w:pPr>
+            <w:r>
+              <w:rPr>
+                <w:b/>
+                <w:sz w:val="18"/>
+              </w:rPr>
+              <w:t>评分区间宽度</w:t>
+            </w:r>
+          </w:p>
+        </w:tc>
+        <w:tc>
+          <w:tcPr>
+            <w:tcW w:type="dxa" w:w="3231"/>
+            <w:shd w:fill="E4EEE9"/>
+            <w:tcMar>
+              <w:top w:w="40" w:type="dxa"/>
+              <w:bottom w:w="40" w:type="dxa"/>
+              <w:left w:w="90" w:type="dxa"/>
+              <w:right w:w="90" w:type="dxa"/>
+            </w:tcMar>
+          </w:tcPr>
+          <w:p>
+            <w:pPr>
+              <w:spacing w:after="60" w:line="271" w:lineRule="auto"/>
+            </w:pPr>
+            <w:r>
+              <w:rPr>
+                <w:b/>
+                <w:sz w:val="18"/>
+              </w:rPr>
+              <w:t>资格判断区间宽度</w:t>
+            </w:r>
+          </w:p>
+        </w:tc>
+        <w:tc>
+          <w:tcPr>
+            <w:tcW w:type="dxa" w:w="3288"/>
+            <w:shd w:fill="E4EEE9"/>
+            <w:tcMar>
+              <w:top w:w="40" w:type="dxa"/>
+              <w:bottom w:w="40" w:type="dxa"/>
+              <w:left w:w="90" w:type="dxa"/>
+              <w:right w:w="90" w:type="dxa"/>
+            </w:tcMar>
+          </w:tcPr>
+          <w:p>
+            <w:pPr>
+              <w:spacing w:after="60" w:line="271" w:lineRule="auto"/>
+            </w:pPr>
+            <w:r>
+              <w:rPr>
+                <w:b/>
+                <w:sz w:val="18"/>
+              </w:rPr>
+              <w:t>变化数 共 1,233</w:t>
+            </w:r>
+          </w:p>
+        </w:tc>
+      </w:tr>
+      <w:tr>
+        <w:trPr>
+          <w:cantSplit/>
+        </w:trPr>
+        <w:tc>
+          <w:tcPr>
+            <w:tcW w:type="dxa" w:w="3005"/>
+            <w:shd w:fill="F5F7F4"/>
+            <w:tcMar>
+              <w:top w:w="40" w:type="dxa"/>
+              <w:bottom w:w="40" w:type="dxa"/>
+              <w:left w:w="90" w:type="dxa"/>
+              <w:right w:w="90" w:type="dxa"/>
+            </w:tcMar>
+          </w:tcPr>
+          <w:p>
+            <w:pPr>
+              <w:spacing w:after="60" w:line="271" w:lineRule="auto"/>
+            </w:pPr>
+            <w:r>
+              <w:rPr>
+                <w:b w:val="0"/>
+                <w:sz w:val="18"/>
+              </w:rPr>
+              <w:t>1×</w:t>
+            </w:r>
+          </w:p>
+        </w:tc>
+        <w:tc>
+          <w:tcPr>
+            <w:tcW w:type="dxa" w:w="3231"/>
+            <w:shd w:fill="F5F7F4"/>
+            <w:tcMar>
+              <w:top w:w="40" w:type="dxa"/>
+              <w:bottom w:w="40" w:type="dxa"/>
+              <w:left w:w="90" w:type="dxa"/>
+              <w:right w:w="90" w:type="dxa"/>
+            </w:tcMar>
+          </w:tcPr>
+          <w:p>
+            <w:pPr>
+              <w:spacing w:after="60" w:line="271" w:lineRule="auto"/>
+            </w:pPr>
+            <w:r>
+              <w:rPr>
+                <w:b w:val="0"/>
+                <w:sz w:val="18"/>
+              </w:rPr>
+              <w:t>1×</w:t>
+            </w:r>
+          </w:p>
+        </w:tc>
+        <w:tc>
+          <w:tcPr>
+            <w:tcW w:type="dxa" w:w="3288"/>
+            <w:shd w:fill="F5F7F4"/>
+            <w:tcMar>
+              <w:top w:w="40" w:type="dxa"/>
+              <w:bottom w:w="40" w:type="dxa"/>
+              <w:left w:w="90" w:type="dxa"/>
+              <w:right w:w="90" w:type="dxa"/>
+            </w:tcMar>
+          </w:tcPr>
+          <w:p>
+            <w:pPr>
+              <w:spacing w:after="60" w:line="271" w:lineRule="auto"/>
+            </w:pPr>
+            <w:r>
+              <w:rPr>
+                <w:b w:val="0"/>
+                <w:sz w:val="18"/>
+              </w:rPr>
+              <w:t>0</w:t>
+            </w:r>
+          </w:p>
+        </w:tc>
+      </w:tr>
+      <w:tr>
+        <w:trPr>
+          <w:cantSplit/>
+        </w:trPr>
+        <w:tc>
+          <w:tcPr>
+            <w:tcW w:type="dxa" w:w="3005"/>
+            <w:shd w:fill="FFFFFF"/>
+            <w:tcMar>
+              <w:top w:w="40" w:type="dxa"/>
+              <w:bottom w:w="40" w:type="dxa"/>
+              <w:left w:w="90" w:type="dxa"/>
+              <w:right w:w="90" w:type="dxa"/>
+            </w:tcMar>
+          </w:tcPr>
+          <w:p>
+            <w:pPr>
+              <w:spacing w:after="60" w:line="271" w:lineRule="auto"/>
+            </w:pPr>
+            <w:r>
+              <w:rPr>
+                <w:b w:val="0"/>
+                <w:sz w:val="18"/>
+              </w:rPr>
+              <w:t>1×</w:t>
+            </w:r>
+          </w:p>
+        </w:tc>
+        <w:tc>
+          <w:tcPr>
+            <w:tcW w:type="dxa" w:w="3231"/>
+            <w:shd w:fill="FFFFFF"/>
+            <w:tcMar>
+              <w:top w:w="40" w:type="dxa"/>
+              <w:bottom w:w="40" w:type="dxa"/>
+              <w:left w:w="90" w:type="dxa"/>
+              <w:right w:w="90" w:type="dxa"/>
+            </w:tcMar>
+          </w:tcPr>
+          <w:p>
+            <w:pPr>
+              <w:spacing w:after="60" w:line="271" w:lineRule="auto"/>
+            </w:pPr>
+            <w:r>
+              <w:rPr>
+                <w:b w:val="0"/>
+                <w:sz w:val="18"/>
+              </w:rPr>
+              <w:t>1.25×</w:t>
+            </w:r>
+          </w:p>
+        </w:tc>
+        <w:tc>
+          <w:tcPr>
+            <w:tcW w:type="dxa" w:w="3288"/>
+            <w:shd w:fill="FFFFFF"/>
+            <w:tcMar>
+              <w:top w:w="40" w:type="dxa"/>
+              <w:bottom w:w="40" w:type="dxa"/>
+              <w:left w:w="90" w:type="dxa"/>
+              <w:right w:w="90" w:type="dxa"/>
+            </w:tcMar>
+          </w:tcPr>
+          <w:p>
+            <w:pPr>
+              <w:spacing w:after="60" w:line="271" w:lineRule="auto"/>
+            </w:pPr>
+            <w:r>
+              <w:rPr>
+                <w:b w:val="0"/>
+                <w:sz w:val="18"/>
+              </w:rPr>
+              <w:t>48</w:t>
+            </w:r>
+          </w:p>
+        </w:tc>
+      </w:tr>
+      <w:tr>
+        <w:trPr>
+          <w:cantSplit/>
+        </w:trPr>
+        <w:tc>
+          <w:tcPr>
+            <w:tcW w:type="dxa" w:w="3005"/>
+            <w:shd w:fill="F5F7F4"/>
+            <w:tcMar>
+              <w:top w:w="40" w:type="dxa"/>
+              <w:bottom w:w="40" w:type="dxa"/>
+              <w:left w:w="90" w:type="dxa"/>
+              <w:right w:w="90" w:type="dxa"/>
+            </w:tcMar>
+          </w:tcPr>
+          <w:p>
+            <w:pPr>
+              <w:spacing w:after="60" w:line="271" w:lineRule="auto"/>
+            </w:pPr>
+            <w:r>
+              <w:rPr>
+                <w:b w:val="0"/>
+                <w:sz w:val="18"/>
+              </w:rPr>
+              <w:t>1.25×</w:t>
+            </w:r>
+          </w:p>
+        </w:tc>
+        <w:tc>
+          <w:tcPr>
+            <w:tcW w:type="dxa" w:w="3231"/>
+            <w:shd w:fill="F5F7F4"/>
+            <w:tcMar>
+              <w:top w:w="40" w:type="dxa"/>
+              <w:bottom w:w="40" w:type="dxa"/>
+              <w:left w:w="90" w:type="dxa"/>
+              <w:right w:w="90" w:type="dxa"/>
+            </w:tcMar>
+          </w:tcPr>
+          <w:p>
+            <w:pPr>
+              <w:spacing w:after="60" w:line="271" w:lineRule="auto"/>
+            </w:pPr>
+            <w:r>
+              <w:rPr>
+                <w:b w:val="0"/>
+                <w:sz w:val="18"/>
+              </w:rPr>
+              <w:t>1×</w:t>
+            </w:r>
+          </w:p>
+        </w:tc>
+        <w:tc>
+          <w:tcPr>
+            <w:tcW w:type="dxa" w:w="3288"/>
+            <w:shd w:fill="F5F7F4"/>
+            <w:tcMar>
+              <w:top w:w="40" w:type="dxa"/>
+              <w:bottom w:w="40" w:type="dxa"/>
+              <w:left w:w="90" w:type="dxa"/>
+              <w:right w:w="90" w:type="dxa"/>
+            </w:tcMar>
+          </w:tcPr>
+          <w:p>
+            <w:pPr>
+              <w:spacing w:after="60" w:line="271" w:lineRule="auto"/>
+            </w:pPr>
+            <w:r>
+              <w:rPr>
+                <w:b w:val="0"/>
+                <w:sz w:val="18"/>
+              </w:rPr>
+              <w:t>150</w:t>
+            </w:r>
+          </w:p>
+        </w:tc>
+      </w:tr>
+      <w:tr>
+        <w:trPr>
+          <w:cantSplit/>
+        </w:trPr>
+        <w:tc>
+          <w:tcPr>
+            <w:tcW w:type="dxa" w:w="3005"/>
+            <w:shd w:fill="FFFFFF"/>
+            <w:tcMar>
+              <w:top w:w="40" w:type="dxa"/>
+              <w:bottom w:w="40" w:type="dxa"/>
+              <w:left w:w="90" w:type="dxa"/>
+              <w:right w:w="90" w:type="dxa"/>
+            </w:tcMar>
+          </w:tcPr>
+          <w:p>
+            <w:pPr>
+              <w:spacing w:after="60" w:line="271" w:lineRule="auto"/>
+            </w:pPr>
+            <w:r>
+              <w:rPr>
+                <w:b w:val="0"/>
+                <w:sz w:val="18"/>
+              </w:rPr>
+              <w:t>1.25×</w:t>
+            </w:r>
+          </w:p>
+        </w:tc>
+        <w:tc>
+          <w:tcPr>
+            <w:tcW w:type="dxa" w:w="3231"/>
+            <w:shd w:fill="FFFFFF"/>
+            <w:tcMar>
+              <w:top w:w="40" w:type="dxa"/>
+              <w:bottom w:w="40" w:type="dxa"/>
+              <w:left w:w="90" w:type="dxa"/>
+              <w:right w:w="90" w:type="dxa"/>
+            </w:tcMar>
+          </w:tcPr>
+          <w:p>
+            <w:pPr>
+              <w:spacing w:after="60" w:line="271" w:lineRule="auto"/>
+            </w:pPr>
+            <w:r>
+              <w:rPr>
+                <w:b w:val="0"/>
+                <w:sz w:val="18"/>
+              </w:rPr>
+              <w:t>1.25×</w:t>
+            </w:r>
+          </w:p>
+        </w:tc>
+        <w:tc>
+          <w:tcPr>
+            <w:tcW w:type="dxa" w:w="3288"/>
+            <w:shd w:fill="FFFFFF"/>
+            <w:tcMar>
+              <w:top w:w="40" w:type="dxa"/>
+              <w:bottom w:w="40" w:type="dxa"/>
+              <w:left w:w="90" w:type="dxa"/>
+              <w:right w:w="90" w:type="dxa"/>
+            </w:tcMar>
+          </w:tcPr>
+          <w:p>
+            <w:pPr>
+              <w:spacing w:after="60" w:line="271" w:lineRule="auto"/>
+            </w:pPr>
+            <w:r>
+              <w:rPr>
+                <w:b w:val="0"/>
+                <w:sz w:val="18"/>
+              </w:rPr>
+              <w:t>150</w:t>
+            </w:r>
+          </w:p>
+        </w:tc>
+      </w:tr>
+    </w:tbl>
+    <w:p>
+      <w:pPr>
+        <w:spacing w:after="0"/>
+      </w:pPr>
+    </w:p>
+    <w:p>
+      <w:r>
+        <w:t>这些混合情境只用于识别实现机制，不是可直接部署的概率区间。联合变化数不等于各行相加；不能据此推断服务结果的因果效应。</w:t>
+      </w:r>
+    </w:p>
+    <w:p>
+      <w:pPr>
+        <w:pStyle w:val="Heading2"/>
+      </w:pPr>
+      <w:r>
+        <w:t>冻结模型的完整测试端点诊断</w:t>
+      </w:r>
+    </w:p>
+    <w:tbl>
+      <w:tblPr>
+        <w:tblW w:type="auto" w:w="0"/>
+        <w:tblLayout w:type="fixed"/>
+        <w:tblLook w:firstColumn="1" w:firstRow="1" w:lastColumn="0" w:lastRow="0" w:noHBand="0" w:noVBand="1" w:val="04A0"/>
+      </w:tblPr>
+      <w:tblGrid>
+        <w:gridCol w:w="1701"/>
+        <w:gridCol w:w="2608"/>
+        <w:gridCol w:w="2608"/>
+        <w:gridCol w:w="2608"/>
+      </w:tblGrid>
+      <w:tr>
+        <w:trPr>
+          <w:tblHeader/>
+          <w:cantSplit/>
+        </w:trPr>
+        <w:tc>
+          <w:tcPr>
+            <w:tcW w:type="dxa" w:w="1701"/>
+            <w:shd w:fill="E4EEE9"/>
+            <w:tcMar>
+              <w:top w:w="40" w:type="dxa"/>
+              <w:bottom w:w="40" w:type="dxa"/>
+              <w:left w:w="90" w:type="dxa"/>
+              <w:right w:w="90" w:type="dxa"/>
+            </w:tcMar>
+          </w:tcPr>
+          <w:p>
+            <w:pPr>
+              <w:spacing w:after="60" w:line="271" w:lineRule="auto"/>
+            </w:pPr>
+            <w:r>
+              <w:rPr>
+                <w:b/>
+                <w:sz w:val="18"/>
+              </w:rPr>
+              <w:t>子集</w:t>
+            </w:r>
+          </w:p>
+        </w:tc>
+        <w:tc>
+          <w:tcPr>
+            <w:tcW w:type="dxa" w:w="2608"/>
+            <w:shd w:fill="E4EEE9"/>
+            <w:tcMar>
+              <w:top w:w="40" w:type="dxa"/>
+              <w:bottom w:w="40" w:type="dxa"/>
+              <w:left w:w="90" w:type="dxa"/>
+              <w:right w:w="90" w:type="dxa"/>
+            </w:tcMar>
+          </w:tcPr>
+          <w:p>
+            <w:pPr>
+              <w:spacing w:after="60" w:line="271" w:lineRule="auto"/>
+            </w:pPr>
+            <w:r>
+              <w:rPr>
+                <w:b/>
+                <w:sz w:val="18"/>
+              </w:rPr>
+              <w:t>全部端点覆盖</w:t>
+            </w:r>
+          </w:p>
+        </w:tc>
+        <w:tc>
+          <w:tcPr>
+            <w:tcW w:type="dxa" w:w="2608"/>
+            <w:shd w:fill="E4EEE9"/>
+            <w:tcMar>
+              <w:top w:w="40" w:type="dxa"/>
+              <w:bottom w:w="40" w:type="dxa"/>
+              <w:left w:w="90" w:type="dxa"/>
+              <w:right w:w="90" w:type="dxa"/>
+            </w:tcMar>
+          </w:tcPr>
+          <w:p>
+            <w:pPr>
+              <w:spacing w:after="60" w:line="271" w:lineRule="auto"/>
+            </w:pPr>
+            <w:r>
+              <w:rPr>
+                <w:b/>
+                <w:sz w:val="18"/>
+              </w:rPr>
+              <w:t>真值不超过125</w:t>
+            </w:r>
+          </w:p>
+        </w:tc>
+        <w:tc>
+          <w:tcPr>
+            <w:tcW w:type="dxa" w:w="2608"/>
+            <w:shd w:fill="E4EEE9"/>
+            <w:tcMar>
+              <w:top w:w="40" w:type="dxa"/>
+              <w:bottom w:w="40" w:type="dxa"/>
+              <w:left w:w="90" w:type="dxa"/>
+              <w:right w:w="90" w:type="dxa"/>
+            </w:tcMar>
+          </w:tcPr>
+          <w:p>
+            <w:pPr>
+              <w:spacing w:after="60" w:line="271" w:lineRule="auto"/>
+            </w:pPr>
+            <w:r>
+              <w:rPr>
+                <w:b/>
+                <w:sz w:val="18"/>
+              </w:rPr>
+              <w:t>真值超过125</w:t>
+            </w:r>
+          </w:p>
+        </w:tc>
+      </w:tr>
+      <w:tr>
+        <w:trPr>
+          <w:cantSplit/>
+        </w:trPr>
+        <w:tc>
+          <w:tcPr>
+            <w:tcW w:type="dxa" w:w="1701"/>
+            <w:shd w:fill="F5F7F4"/>
+            <w:tcMar>
+              <w:top w:w="40" w:type="dxa"/>
+              <w:bottom w:w="40" w:type="dxa"/>
+              <w:left w:w="90" w:type="dxa"/>
+              <w:right w:w="90" w:type="dxa"/>
+            </w:tcMar>
+          </w:tcPr>
+          <w:p>
+            <w:pPr>
+              <w:spacing w:after="60" w:line="271" w:lineRule="auto"/>
+            </w:pPr>
+            <w:r>
+              <w:rPr>
+                <w:b w:val="0"/>
+                <w:sz w:val="18"/>
+              </w:rPr>
+              <w:t>FD001</w:t>
+            </w:r>
+          </w:p>
+        </w:tc>
+        <w:tc>
+          <w:tcPr>
+            <w:tcW w:type="dxa" w:w="2608"/>
+            <w:shd w:fill="F5F7F4"/>
+            <w:tcMar>
+              <w:top w:w="40" w:type="dxa"/>
+              <w:bottom w:w="40" w:type="dxa"/>
+              <w:left w:w="90" w:type="dxa"/>
+              <w:right w:w="90" w:type="dxa"/>
+            </w:tcMar>
+          </w:tcPr>
+          <w:p>
+            <w:pPr>
+              <w:spacing w:after="60" w:line="271" w:lineRule="auto"/>
+            </w:pPr>
+            <w:r>
+              <w:rPr>
+                <w:b w:val="0"/>
+                <w:sz w:val="18"/>
+              </w:rPr>
+              <w:t>78/100</w:t>
+            </w:r>
+          </w:p>
+        </w:tc>
+        <w:tc>
+          <w:tcPr>
+            <w:tcW w:type="dxa" w:w="2608"/>
+            <w:shd w:fill="F5F7F4"/>
+            <w:tcMar>
+              <w:top w:w="40" w:type="dxa"/>
+              <w:bottom w:w="40" w:type="dxa"/>
+              <w:left w:w="90" w:type="dxa"/>
+              <w:right w:w="90" w:type="dxa"/>
+            </w:tcMar>
+          </w:tcPr>
+          <w:p>
+            <w:pPr>
+              <w:spacing w:after="60" w:line="271" w:lineRule="auto"/>
+            </w:pPr>
+            <w:r>
+              <w:rPr>
+                <w:b w:val="0"/>
+                <w:sz w:val="18"/>
+              </w:rPr>
+              <w:t>78/89</w:t>
+            </w:r>
+          </w:p>
+        </w:tc>
+        <w:tc>
+          <w:tcPr>
+            <w:tcW w:type="dxa" w:w="2608"/>
+            <w:shd w:fill="F5F7F4"/>
+            <w:tcMar>
+              <w:top w:w="40" w:type="dxa"/>
+              <w:bottom w:w="40" w:type="dxa"/>
+              <w:left w:w="90" w:type="dxa"/>
+              <w:right w:w="90" w:type="dxa"/>
+            </w:tcMar>
+          </w:tcPr>
+          <w:p>
+            <w:pPr>
+              <w:spacing w:after="60" w:line="271" w:lineRule="auto"/>
+            </w:pPr>
+            <w:r>
+              <w:rPr>
+                <w:b w:val="0"/>
+                <w:sz w:val="18"/>
+              </w:rPr>
+              <w:t>0/11</w:t>
+            </w:r>
+          </w:p>
+        </w:tc>
+      </w:tr>
+      <w:tr>
+        <w:trPr>
+          <w:cantSplit/>
+        </w:trPr>
+        <w:tc>
+          <w:tcPr>
+            <w:tcW w:type="dxa" w:w="1701"/>
+            <w:shd w:fill="FFFFFF"/>
+            <w:tcMar>
+              <w:top w:w="40" w:type="dxa"/>
+              <w:bottom w:w="40" w:type="dxa"/>
+              <w:left w:w="90" w:type="dxa"/>
+              <w:right w:w="90" w:type="dxa"/>
+            </w:tcMar>
+          </w:tcPr>
+          <w:p>
+            <w:pPr>
+              <w:spacing w:after="60" w:line="271" w:lineRule="auto"/>
+            </w:pPr>
+            <w:r>
+              <w:rPr>
+                <w:b w:val="0"/>
+                <w:sz w:val="18"/>
+              </w:rPr>
+              <w:t>FD002</w:t>
+            </w:r>
+          </w:p>
+        </w:tc>
+        <w:tc>
+          <w:tcPr>
+            <w:tcW w:type="dxa" w:w="2608"/>
+            <w:shd w:fill="FFFFFF"/>
+            <w:tcMar>
+              <w:top w:w="40" w:type="dxa"/>
+              <w:bottom w:w="40" w:type="dxa"/>
+              <w:left w:w="90" w:type="dxa"/>
+              <w:right w:w="90" w:type="dxa"/>
+            </w:tcMar>
+          </w:tcPr>
+          <w:p>
+            <w:pPr>
+              <w:spacing w:after="60" w:line="271" w:lineRule="auto"/>
+            </w:pPr>
+            <w:r>
+              <w:rPr>
+                <w:b w:val="0"/>
+                <w:sz w:val="18"/>
+              </w:rPr>
+              <w:t>174/259</w:t>
+            </w:r>
+          </w:p>
+        </w:tc>
+        <w:tc>
+          <w:tcPr>
+            <w:tcW w:type="dxa" w:w="2608"/>
+            <w:shd w:fill="FFFFFF"/>
+            <w:tcMar>
+              <w:top w:w="40" w:type="dxa"/>
+              <w:bottom w:w="40" w:type="dxa"/>
+              <w:left w:w="90" w:type="dxa"/>
+              <w:right w:w="90" w:type="dxa"/>
+            </w:tcMar>
+          </w:tcPr>
+          <w:p>
+            <w:pPr>
+              <w:spacing w:after="60" w:line="271" w:lineRule="auto"/>
+            </w:pPr>
+            <w:r>
+              <w:rPr>
+                <w:b w:val="0"/>
+                <w:sz w:val="18"/>
+              </w:rPr>
+              <w:t>174/202</w:t>
+            </w:r>
+          </w:p>
+        </w:tc>
+        <w:tc>
+          <w:tcPr>
+            <w:tcW w:type="dxa" w:w="2608"/>
+            <w:shd w:fill="FFFFFF"/>
+            <w:tcMar>
+              <w:top w:w="40" w:type="dxa"/>
+              <w:bottom w:w="40" w:type="dxa"/>
+              <w:left w:w="90" w:type="dxa"/>
+              <w:right w:w="90" w:type="dxa"/>
+            </w:tcMar>
+          </w:tcPr>
+          <w:p>
+            <w:pPr>
+              <w:spacing w:after="60" w:line="271" w:lineRule="auto"/>
+            </w:pPr>
+            <w:r>
+              <w:rPr>
+                <w:b w:val="0"/>
+                <w:sz w:val="18"/>
+              </w:rPr>
+              <w:t>0/57</w:t>
+            </w:r>
+          </w:p>
+        </w:tc>
+      </w:tr>
+      <w:tr>
+        <w:trPr>
+          <w:cantSplit/>
+        </w:trPr>
+        <w:tc>
+          <w:tcPr>
+            <w:tcW w:type="dxa" w:w="1701"/>
+            <w:shd w:fill="F5F7F4"/>
+            <w:tcMar>
+              <w:top w:w="40" w:type="dxa"/>
+              <w:bottom w:w="40" w:type="dxa"/>
+              <w:left w:w="90" w:type="dxa"/>
+              <w:right w:w="90" w:type="dxa"/>
+            </w:tcMar>
+          </w:tcPr>
+          <w:p>
+            <w:pPr>
+              <w:spacing w:after="60" w:line="271" w:lineRule="auto"/>
+            </w:pPr>
+            <w:r>
+              <w:rPr>
+                <w:b w:val="0"/>
+                <w:sz w:val="18"/>
+              </w:rPr>
+              <w:t>FD003</w:t>
+            </w:r>
+          </w:p>
+        </w:tc>
+        <w:tc>
+          <w:tcPr>
+            <w:tcW w:type="dxa" w:w="2608"/>
+            <w:shd w:fill="F5F7F4"/>
+            <w:tcMar>
+              <w:top w:w="40" w:type="dxa"/>
+              <w:bottom w:w="40" w:type="dxa"/>
+              <w:left w:w="90" w:type="dxa"/>
+              <w:right w:w="90" w:type="dxa"/>
+            </w:tcMar>
+          </w:tcPr>
+          <w:p>
+            <w:pPr>
+              <w:spacing w:after="60" w:line="271" w:lineRule="auto"/>
+            </w:pPr>
+            <w:r>
+              <w:rPr>
+                <w:b w:val="0"/>
+                <w:sz w:val="18"/>
+              </w:rPr>
+              <w:t>69/100</w:t>
+            </w:r>
+          </w:p>
+        </w:tc>
+        <w:tc>
+          <w:tcPr>
+            <w:tcW w:type="dxa" w:w="2608"/>
+            <w:shd w:fill="F5F7F4"/>
+            <w:tcMar>
+              <w:top w:w="40" w:type="dxa"/>
+              <w:bottom w:w="40" w:type="dxa"/>
+              <w:left w:w="90" w:type="dxa"/>
+              <w:right w:w="90" w:type="dxa"/>
+            </w:tcMar>
+          </w:tcPr>
+          <w:p>
+            <w:pPr>
+              <w:spacing w:after="60" w:line="271" w:lineRule="auto"/>
+            </w:pPr>
+            <w:r>
+              <w:rPr>
+                <w:b w:val="0"/>
+                <w:sz w:val="18"/>
+              </w:rPr>
+              <w:t>69/85</w:t>
+            </w:r>
+          </w:p>
+        </w:tc>
+        <w:tc>
+          <w:tcPr>
+            <w:tcW w:type="dxa" w:w="2608"/>
+            <w:shd w:fill="F5F7F4"/>
+            <w:tcMar>
+              <w:top w:w="40" w:type="dxa"/>
+              <w:bottom w:w="40" w:type="dxa"/>
+              <w:left w:w="90" w:type="dxa"/>
+              <w:right w:w="90" w:type="dxa"/>
+            </w:tcMar>
+          </w:tcPr>
+          <w:p>
+            <w:pPr>
+              <w:spacing w:after="60" w:line="271" w:lineRule="auto"/>
+            </w:pPr>
+            <w:r>
+              <w:rPr>
+                <w:b w:val="0"/>
+                <w:sz w:val="18"/>
+              </w:rPr>
+              <w:t>0/15</w:t>
+            </w:r>
+          </w:p>
+        </w:tc>
+      </w:tr>
+      <w:tr>
+        <w:trPr>
+          <w:cantSplit/>
+        </w:trPr>
+        <w:tc>
+          <w:tcPr>
+            <w:tcW w:type="dxa" w:w="1701"/>
+            <w:shd w:fill="FFFFFF"/>
+            <w:tcMar>
+              <w:top w:w="40" w:type="dxa"/>
+              <w:bottom w:w="40" w:type="dxa"/>
+              <w:left w:w="90" w:type="dxa"/>
+              <w:right w:w="90" w:type="dxa"/>
+            </w:tcMar>
+          </w:tcPr>
+          <w:p>
+            <w:pPr>
+              <w:spacing w:after="60" w:line="271" w:lineRule="auto"/>
+            </w:pPr>
+            <w:r>
+              <w:rPr>
+                <w:b w:val="0"/>
+                <w:sz w:val="18"/>
+              </w:rPr>
+              <w:t>FD004</w:t>
+            </w:r>
+          </w:p>
+        </w:tc>
+        <w:tc>
+          <w:tcPr>
+            <w:tcW w:type="dxa" w:w="2608"/>
+            <w:shd w:fill="FFFFFF"/>
+            <w:tcMar>
+              <w:top w:w="40" w:type="dxa"/>
+              <w:bottom w:w="40" w:type="dxa"/>
+              <w:left w:w="90" w:type="dxa"/>
+              <w:right w:w="90" w:type="dxa"/>
+            </w:tcMar>
+          </w:tcPr>
+          <w:p>
+            <w:pPr>
+              <w:spacing w:after="60" w:line="271" w:lineRule="auto"/>
+            </w:pPr>
+            <w:r>
+              <w:rPr>
+                <w:b w:val="0"/>
+                <w:sz w:val="18"/>
+              </w:rPr>
+              <w:t>152/248</w:t>
+            </w:r>
+          </w:p>
+        </w:tc>
+        <w:tc>
+          <w:tcPr>
+            <w:tcW w:type="dxa" w:w="2608"/>
+            <w:shd w:fill="FFFFFF"/>
+            <w:tcMar>
+              <w:top w:w="40" w:type="dxa"/>
+              <w:bottom w:w="40" w:type="dxa"/>
+              <w:left w:w="90" w:type="dxa"/>
+              <w:right w:w="90" w:type="dxa"/>
+            </w:tcMar>
+          </w:tcPr>
+          <w:p>
+            <w:pPr>
+              <w:spacing w:after="60" w:line="271" w:lineRule="auto"/>
+            </w:pPr>
+            <w:r>
+              <w:rPr>
+                <w:b w:val="0"/>
+                <w:sz w:val="18"/>
+              </w:rPr>
+              <w:t>152/181</w:t>
+            </w:r>
+          </w:p>
+        </w:tc>
+        <w:tc>
+          <w:tcPr>
+            <w:tcW w:type="dxa" w:w="2608"/>
+            <w:shd w:fill="FFFFFF"/>
+            <w:tcMar>
+              <w:top w:w="40" w:type="dxa"/>
+              <w:bottom w:w="40" w:type="dxa"/>
+              <w:left w:w="90" w:type="dxa"/>
+              <w:right w:w="90" w:type="dxa"/>
+            </w:tcMar>
+          </w:tcPr>
+          <w:p>
+            <w:pPr>
+              <w:spacing w:after="60" w:line="271" w:lineRule="auto"/>
+            </w:pPr>
+            <w:r>
+              <w:rPr>
+                <w:b w:val="0"/>
+                <w:sz w:val="18"/>
+              </w:rPr>
+              <w:t>0/67</w:t>
+            </w:r>
+          </w:p>
+        </w:tc>
+      </w:tr>
+    </w:tbl>
+    <w:p>
+      <w:pPr>
+        <w:spacing w:after="0"/>
+      </w:pPr>
+    </w:p>
+    <w:p>
+      <w:r>
+        <w:t>区间上限被裁到 125 周期，因此所有真值超过 125 的端点都无法被覆盖。分层结果用于解释限制，不能替代保留未封顶真值的整体评价，也不能证明校准。FD001 端点重新构建并与已发布模型、八台回放端点及整体指标核对；没有用测试标签调参。</w:t>
+      </w:r>
+    </w:p>
+    <w:p>
+      <w:r>
+        <w:br w:type="page"/>
+      </w:r>
+    </w:p>
+    <w:p>
+      <w:pPr>
+        <w:pStyle w:val="Heading1"/>
+      </w:pPr>
+      <w:r>
+        <w:t>13 扩展语义评价与外部验证方案</w:t>
+      </w:r>
+    </w:p>
+    <w:p>
+      <w:r>
+        <w:t>原七个展示样例保留。本轮在不修改验证规则的条件下增加 35 个本项目设计的回归样例：五类缺陷的全部 32 种组合，以及合同版本同步更新、旧建议版本残留、身份标识一致迁移三个任务。两种实现均满足预期检查，查询结果一致。</w:t>
+      </w:r>
+    </w:p>
+    <w:p>
+      <w:r>
+        <w:t>这些新样例仍由本项目设计，不是独立评审、未见测试集或广泛互操作性验证；没有测量人员修改工作量。相同结果说明限定任务的功能一致性，不说明哪种技术更优。</w:t>
+      </w:r>
+    </w:p>
+    <w:p>
+      <w:pPr>
+        <w:pStyle w:val="Heading2"/>
+      </w:pPr>
+      <w:r>
+        <w:t>独立评价的执行方案 尚未开展</w:t>
+      </w:r>
+    </w:p>
+    <w:tbl>
+      <w:tblPr>
+        <w:tblW w:type="auto" w:w="0"/>
+        <w:tblLayout w:type="fixed"/>
+        <w:tblLook w:firstColumn="1" w:firstRow="1" w:lastColumn="0" w:lastRow="0" w:noHBand="0" w:noVBand="1" w:val="04A0"/>
+      </w:tblPr>
+      <w:tblGrid>
+        <w:gridCol w:w="1928"/>
+        <w:gridCol w:w="7597"/>
+      </w:tblGrid>
+      <w:tr>
+        <w:trPr>
+          <w:tblHeader/>
+          <w:cantSplit/>
+        </w:trPr>
+        <w:tc>
+          <w:tcPr>
+            <w:tcW w:type="dxa" w:w="1928"/>
+            <w:shd w:fill="E4EEE9"/>
+            <w:tcMar>
+              <w:top w:w="40" w:type="dxa"/>
+              <w:bottom w:w="40" w:type="dxa"/>
+              <w:left w:w="90" w:type="dxa"/>
+              <w:right w:w="90" w:type="dxa"/>
+            </w:tcMar>
+          </w:tcPr>
+          <w:p>
+            <w:pPr>
+              <w:spacing w:after="60" w:line="271" w:lineRule="auto"/>
+            </w:pPr>
+            <w:r>
+              <w:rPr>
+                <w:b/>
+                <w:sz w:val="18"/>
+              </w:rPr>
+              <w:t>步骤</w:t>
+            </w:r>
+          </w:p>
+        </w:tc>
+        <w:tc>
+          <w:tcPr>
+            <w:tcW w:type="dxa" w:w="7597"/>
+            <w:shd w:fill="E4EEE9"/>
+            <w:tcMar>
+              <w:top w:w="40" w:type="dxa"/>
+              <w:bottom w:w="40" w:type="dxa"/>
+              <w:left w:w="90" w:type="dxa"/>
+              <w:right w:w="90" w:type="dxa"/>
+            </w:tcMar>
+          </w:tcPr>
+          <w:p>
+            <w:pPr>
+              <w:spacing w:after="60" w:line="271" w:lineRule="auto"/>
+            </w:pPr>
+            <w:r>
+              <w:rPr>
+                <w:b/>
+                <w:sz w:val="18"/>
+              </w:rPr>
+              <w:t>待执行要求</w:t>
+            </w:r>
+          </w:p>
+        </w:tc>
+      </w:tr>
+      <w:tr>
+        <w:trPr>
+          <w:cantSplit/>
+        </w:trPr>
+        <w:tc>
+          <w:tcPr>
+            <w:tcW w:type="dxa" w:w="1928"/>
+            <w:shd w:fill="F5F7F4"/>
+            <w:tcMar>
+              <w:top w:w="40" w:type="dxa"/>
+              <w:bottom w:w="40" w:type="dxa"/>
+              <w:left w:w="90" w:type="dxa"/>
+              <w:right w:w="90" w:type="dxa"/>
+            </w:tcMar>
+          </w:tcPr>
+          <w:p>
+            <w:pPr>
+              <w:spacing w:after="60" w:line="271" w:lineRule="auto"/>
+            </w:pPr>
+            <w:r>
+              <w:rPr>
+                <w:b w:val="0"/>
+                <w:sz w:val="18"/>
+              </w:rPr>
+              <w:t>先冻结问题</w:t>
+            </w:r>
+          </w:p>
+        </w:tc>
+        <w:tc>
+          <w:tcPr>
+            <w:tcW w:type="dxa" w:w="7597"/>
+            <w:shd w:fill="F5F7F4"/>
+            <w:tcMar>
+              <w:top w:w="40" w:type="dxa"/>
+              <w:bottom w:w="40" w:type="dxa"/>
+              <w:left w:w="90" w:type="dxa"/>
+              <w:right w:w="90" w:type="dxa"/>
+            </w:tcMar>
+          </w:tcPr>
+          <w:p>
+            <w:pPr>
+              <w:spacing w:after="60" w:line="271" w:lineRule="auto"/>
+            </w:pPr>
+            <w:r>
+              <w:rPr>
+                <w:b w:val="0"/>
+                <w:sz w:val="18"/>
+              </w:rPr>
+              <w:t>约定资产、模型、来源、合同版本追溯与变更影响问题；明确应有答案。</w:t>
+            </w:r>
+          </w:p>
+        </w:tc>
+      </w:tr>
+      <w:tr>
+        <w:trPr>
+          <w:cantSplit/>
+        </w:trPr>
+        <w:tc>
+          <w:tcPr>
+            <w:tcW w:type="dxa" w:w="1928"/>
+            <w:shd w:fill="FFFFFF"/>
+            <w:tcMar>
+              <w:top w:w="40" w:type="dxa"/>
+              <w:bottom w:w="40" w:type="dxa"/>
+              <w:left w:w="90" w:type="dxa"/>
+              <w:right w:w="90" w:type="dxa"/>
+            </w:tcMar>
+          </w:tcPr>
+          <w:p>
+            <w:pPr>
+              <w:spacing w:after="60" w:line="271" w:lineRule="auto"/>
+            </w:pPr>
+            <w:r>
+              <w:rPr>
+                <w:b w:val="0"/>
+                <w:sz w:val="18"/>
+              </w:rPr>
+              <w:t>外部设计样例</w:t>
+            </w:r>
+          </w:p>
+        </w:tc>
+        <w:tc>
+          <w:tcPr>
+            <w:tcW w:type="dxa" w:w="7597"/>
+            <w:shd w:fill="FFFFFF"/>
+            <w:tcMar>
+              <w:top w:w="40" w:type="dxa"/>
+              <w:bottom w:w="40" w:type="dxa"/>
+              <w:left w:w="90" w:type="dxa"/>
+              <w:right w:w="90" w:type="dxa"/>
+            </w:tcMar>
+          </w:tcPr>
+          <w:p>
+            <w:pPr>
+              <w:spacing w:after="60" w:line="271" w:lineRule="auto"/>
+            </w:pPr>
+            <w:r>
+              <w:rPr>
+                <w:b w:val="0"/>
+                <w:sz w:val="18"/>
+              </w:rPr>
+              <w:t>由实现者以外的评审者提供保留样例、未见缺陷与另一来源结构。</w:t>
+            </w:r>
+          </w:p>
+        </w:tc>
+      </w:tr>
+      <w:tr>
+        <w:trPr>
+          <w:cantSplit/>
+        </w:trPr>
+        <w:tc>
+          <w:tcPr>
+            <w:tcW w:type="dxa" w:w="1928"/>
+            <w:shd w:fill="F5F7F4"/>
+            <w:tcMar>
+              <w:top w:w="40" w:type="dxa"/>
+              <w:bottom w:w="40" w:type="dxa"/>
+              <w:left w:w="90" w:type="dxa"/>
+              <w:right w:w="90" w:type="dxa"/>
+            </w:tcMar>
+          </w:tcPr>
+          <w:p>
+            <w:pPr>
+              <w:spacing w:after="60" w:line="271" w:lineRule="auto"/>
+            </w:pPr>
+            <w:r>
+              <w:rPr>
+                <w:b w:val="0"/>
+                <w:sz w:val="18"/>
+              </w:rPr>
+              <w:t>公平执行</w:t>
+            </w:r>
+          </w:p>
+        </w:tc>
+        <w:tc>
+          <w:tcPr>
+            <w:tcW w:type="dxa" w:w="7597"/>
+            <w:shd w:fill="F5F7F4"/>
+            <w:tcMar>
+              <w:top w:w="40" w:type="dxa"/>
+              <w:bottom w:w="40" w:type="dxa"/>
+              <w:left w:w="90" w:type="dxa"/>
+              <w:right w:w="90" w:type="dxa"/>
+            </w:tcMar>
+          </w:tcPr>
+          <w:p>
+            <w:pPr>
+              <w:spacing w:after="60" w:line="271" w:lineRule="auto"/>
+            </w:pPr>
+            <w:r>
+              <w:rPr>
+                <w:b w:val="0"/>
+                <w:sz w:val="18"/>
+              </w:rPr>
+              <w:t>JSON 与 RDF 接收相同输入、错误类型和修改任务；不得为某一方案降低要求。</w:t>
+            </w:r>
+          </w:p>
+        </w:tc>
+      </w:tr>
+      <w:tr>
+        <w:trPr>
+          <w:cantSplit/>
+        </w:trPr>
+        <w:tc>
+          <w:tcPr>
+            <w:tcW w:type="dxa" w:w="1928"/>
+            <w:shd w:fill="FFFFFF"/>
+            <w:tcMar>
+              <w:top w:w="40" w:type="dxa"/>
+              <w:bottom w:w="40" w:type="dxa"/>
+              <w:left w:w="90" w:type="dxa"/>
+              <w:right w:w="90" w:type="dxa"/>
+            </w:tcMar>
+          </w:tcPr>
+          <w:p>
+            <w:pPr>
+              <w:spacing w:after="60" w:line="271" w:lineRule="auto"/>
+            </w:pPr>
+            <w:r>
+              <w:rPr>
+                <w:b w:val="0"/>
+                <w:sz w:val="18"/>
+              </w:rPr>
+              <w:t>记录结果</w:t>
+            </w:r>
+          </w:p>
+        </w:tc>
+        <w:tc>
+          <w:tcPr>
+            <w:tcW w:type="dxa" w:w="7597"/>
+            <w:shd w:fill="FFFFFF"/>
+            <w:tcMar>
+              <w:top w:w="40" w:type="dxa"/>
+              <w:bottom w:w="40" w:type="dxa"/>
+              <w:left w:w="90" w:type="dxa"/>
+              <w:right w:w="90" w:type="dxa"/>
+            </w:tcMar>
+          </w:tcPr>
+          <w:p>
+            <w:pPr>
+              <w:spacing w:after="60" w:line="271" w:lineRule="auto"/>
+            </w:pPr>
+            <w:r>
+              <w:rPr>
+                <w:b w:val="0"/>
+                <w:sz w:val="18"/>
+              </w:rPr>
+              <w:t>保存正确性、信息丢失、修改记录与评审工作量；不要只报告通过比例。</w:t>
+            </w:r>
+          </w:p>
+        </w:tc>
+      </w:tr>
+    </w:tbl>
+    <w:p>
+      <w:pPr>
+        <w:spacing w:after="0"/>
+      </w:pPr>
+    </w:p>
+    <w:p>
+      <w:pPr>
+        <w:pStyle w:val="Heading2"/>
+      </w:pPr>
+      <w:r>
+        <w:t>真实服务效果的数据要求 尚未采集</w:t>
+      </w:r>
+    </w:p>
+    <w:p>
+      <w:r>
+        <w:t>应分别记录提出建议、人工批准、实际执行与结果，不能把它们写成同一事件。网页提供可导出的评价方案，所列字段是待采集要求，不含虚构个体、合同或收益。</w:t>
+      </w:r>
+    </w:p>
+    <w:tbl>
+      <w:tblPr>
+        <w:tblW w:type="auto" w:w="0"/>
+        <w:tblLayout w:type="fixed"/>
+        <w:tblLook w:firstColumn="1" w:firstRow="1" w:lastColumn="0" w:lastRow="0" w:noHBand="0" w:noVBand="1" w:val="04A0"/>
+      </w:tblPr>
+      <w:tblGrid>
+        <w:gridCol w:w="1928"/>
+        <w:gridCol w:w="7597"/>
+      </w:tblGrid>
+      <w:tr>
+        <w:trPr>
+          <w:tblHeader/>
+          <w:cantSplit/>
+        </w:trPr>
+        <w:tc>
+          <w:tcPr>
+            <w:tcW w:type="dxa" w:w="1928"/>
+            <w:shd w:fill="E4EEE9"/>
+            <w:tcMar>
+              <w:top w:w="40" w:type="dxa"/>
+              <w:bottom w:w="40" w:type="dxa"/>
+              <w:left w:w="90" w:type="dxa"/>
+              <w:right w:w="90" w:type="dxa"/>
+            </w:tcMar>
+          </w:tcPr>
+          <w:p>
+            <w:pPr>
+              <w:spacing w:after="60" w:line="271" w:lineRule="auto"/>
+            </w:pPr>
+            <w:r>
+              <w:rPr>
+                <w:b/>
+                <w:sz w:val="18"/>
+              </w:rPr>
+              <w:t>记录组</w:t>
+            </w:r>
+          </w:p>
+        </w:tc>
+        <w:tc>
+          <w:tcPr>
+            <w:tcW w:type="dxa" w:w="7597"/>
+            <w:shd w:fill="E4EEE9"/>
+            <w:tcMar>
+              <w:top w:w="40" w:type="dxa"/>
+              <w:bottom w:w="40" w:type="dxa"/>
+              <w:left w:w="90" w:type="dxa"/>
+              <w:right w:w="90" w:type="dxa"/>
+            </w:tcMar>
+          </w:tcPr>
+          <w:p>
+            <w:pPr>
+              <w:spacing w:after="60" w:line="271" w:lineRule="auto"/>
+            </w:pPr>
+            <w:r>
+              <w:rPr>
+                <w:b/>
+                <w:sz w:val="18"/>
+              </w:rPr>
+              <w:t>最低信息要求</w:t>
+            </w:r>
+          </w:p>
+        </w:tc>
+      </w:tr>
+      <w:tr>
+        <w:trPr>
+          <w:cantSplit/>
+        </w:trPr>
+        <w:tc>
+          <w:tcPr>
+            <w:tcW w:type="dxa" w:w="1928"/>
+            <w:shd w:fill="F5F7F4"/>
+            <w:tcMar>
+              <w:top w:w="40" w:type="dxa"/>
+              <w:bottom w:w="40" w:type="dxa"/>
+              <w:left w:w="90" w:type="dxa"/>
+              <w:right w:w="90" w:type="dxa"/>
+            </w:tcMar>
+          </w:tcPr>
+          <w:p>
+            <w:pPr>
+              <w:spacing w:after="60" w:line="271" w:lineRule="auto"/>
+            </w:pPr>
+            <w:r>
+              <w:rPr>
+                <w:b w:val="0"/>
+                <w:sz w:val="18"/>
+              </w:rPr>
+              <w:t>身份与责任</w:t>
+            </w:r>
+          </w:p>
+        </w:tc>
+        <w:tc>
+          <w:tcPr>
+            <w:tcW w:type="dxa" w:w="7597"/>
+            <w:shd w:fill="F5F7F4"/>
+            <w:tcMar>
+              <w:top w:w="40" w:type="dxa"/>
+              <w:bottom w:w="40" w:type="dxa"/>
+              <w:left w:w="90" w:type="dxa"/>
+              <w:right w:w="90" w:type="dxa"/>
+            </w:tcMar>
+          </w:tcPr>
+          <w:p>
+            <w:pPr>
+              <w:spacing w:after="60" w:line="271" w:lineRule="auto"/>
+            </w:pPr>
+            <w:r>
+              <w:rPr>
+                <w:b w:val="0"/>
+                <w:sz w:val="18"/>
+              </w:rPr>
+              <w:t>匿名资产 ID、合同及版本、有效权限、责任与成本依据。</w:t>
+            </w:r>
+          </w:p>
+        </w:tc>
+      </w:tr>
+      <w:tr>
+        <w:trPr>
+          <w:cantSplit/>
+        </w:trPr>
+        <w:tc>
+          <w:tcPr>
+            <w:tcW w:type="dxa" w:w="1928"/>
+            <w:shd w:fill="FFFFFF"/>
+            <w:tcMar>
+              <w:top w:w="40" w:type="dxa"/>
+              <w:bottom w:w="40" w:type="dxa"/>
+              <w:left w:w="90" w:type="dxa"/>
+              <w:right w:w="90" w:type="dxa"/>
+            </w:tcMar>
+          </w:tcPr>
+          <w:p>
+            <w:pPr>
+              <w:spacing w:after="60" w:line="271" w:lineRule="auto"/>
+            </w:pPr>
+            <w:r>
+              <w:rPr>
+                <w:b w:val="0"/>
+                <w:sz w:val="18"/>
+              </w:rPr>
+              <w:t>决策与执行</w:t>
+            </w:r>
+          </w:p>
+        </w:tc>
+        <w:tc>
+          <w:tcPr>
+            <w:tcW w:type="dxa" w:w="7597"/>
+            <w:shd w:fill="FFFFFF"/>
+            <w:tcMar>
+              <w:top w:w="40" w:type="dxa"/>
+              <w:bottom w:w="40" w:type="dxa"/>
+              <w:left w:w="90" w:type="dxa"/>
+              <w:right w:w="90" w:type="dxa"/>
+            </w:tcMar>
+          </w:tcPr>
+          <w:p>
+            <w:pPr>
+              <w:spacing w:after="60" w:line="271" w:lineRule="auto"/>
+            </w:pPr>
+            <w:r>
+              <w:rPr>
+                <w:b w:val="0"/>
+                <w:sz w:val="18"/>
+              </w:rPr>
+              <w:t>决策时间、当时可用证据、拟议行动、批准行动、审查人、实际干预与时间。</w:t>
+            </w:r>
+          </w:p>
+        </w:tc>
+      </w:tr>
+      <w:tr>
+        <w:trPr>
+          <w:cantSplit/>
+        </w:trPr>
+        <w:tc>
+          <w:tcPr>
+            <w:tcW w:type="dxa" w:w="1928"/>
+            <w:shd w:fill="F5F7F4"/>
+            <w:tcMar>
+              <w:top w:w="40" w:type="dxa"/>
+              <w:bottom w:w="40" w:type="dxa"/>
+              <w:left w:w="90" w:type="dxa"/>
+              <w:right w:w="90" w:type="dxa"/>
+            </w:tcMar>
+          </w:tcPr>
+          <w:p>
+            <w:pPr>
+              <w:spacing w:after="60" w:line="271" w:lineRule="auto"/>
+            </w:pPr>
+            <w:r>
+              <w:rPr>
+                <w:b w:val="0"/>
+                <w:sz w:val="18"/>
+              </w:rPr>
+              <w:t>结果与比较</w:t>
+            </w:r>
+          </w:p>
+        </w:tc>
+        <w:tc>
+          <w:tcPr>
+            <w:tcW w:type="dxa" w:w="7597"/>
+            <w:shd w:fill="F5F7F4"/>
+            <w:tcMar>
+              <w:top w:w="40" w:type="dxa"/>
+              <w:bottom w:w="40" w:type="dxa"/>
+              <w:left w:w="90" w:type="dxa"/>
+              <w:right w:w="90" w:type="dxa"/>
+            </w:tcMar>
+          </w:tcPr>
+          <w:p>
+            <w:pPr>
+              <w:spacing w:after="60" w:line="271" w:lineRule="auto"/>
+            </w:pPr>
+            <w:r>
+              <w:rPr>
+                <w:b w:val="0"/>
+                <w:sz w:val="18"/>
+              </w:rPr>
+              <w:t>停机或暴露的测量周期、实际服务结果、可比较基线与混杂因素。</w:t>
+            </w:r>
+          </w:p>
+        </w:tc>
+      </w:tr>
+    </w:tbl>
+    <w:p>
+      <w:pPr>
+        <w:spacing w:after="0"/>
+      </w:pPr>
+    </w:p>
+    <w:p>
+      <w:r>
+        <w:t>在收集结果前规定研究对象、服务结果、观察期和比较基线。用同一套假设成本函数计算较低得分，不能作为真实运营收益的独立证明。</w:t>
+      </w:r>
+    </w:p>
+    <w:p>
+      <w:r>
+        <w:br w:type="page"/>
+      </w:r>
+    </w:p>
+    <w:p>
+      <w:pPr>
+        <w:pStyle w:val="Heading1"/>
+      </w:pPr>
+      <w:r>
+        <w:t>14 文献定位与本轮复审</w:t>
+      </w:r>
+    </w:p>
+    <w:p>
+      <w:r>
+        <w:t>本轮增加有限范围的来源对照。下列来源的读取范围已在网页列明；这不是系统综述，也不能将来源没有提到某一功能解释为该功能不存在。</w:t>
+      </w:r>
+    </w:p>
+    <w:tbl>
+      <w:tblPr>
+        <w:tblW w:type="auto" w:w="0"/>
+        <w:tblLayout w:type="fixed"/>
+        <w:tblLook w:firstColumn="1" w:firstRow="1" w:lastColumn="0" w:lastRow="0" w:noHBand="0" w:noVBand="1" w:val="04A0"/>
+      </w:tblPr>
+      <w:tblGrid>
+        <w:gridCol w:w="2891"/>
+        <w:gridCol w:w="6633"/>
+      </w:tblGrid>
+      <w:tr>
+        <w:trPr>
+          <w:tblHeader/>
+          <w:cantSplit/>
+        </w:trPr>
+        <w:tc>
+          <w:tcPr>
+            <w:tcW w:type="dxa" w:w="2891"/>
+            <w:shd w:fill="E4EEE9"/>
+            <w:tcMar>
+              <w:top w:w="40" w:type="dxa"/>
+              <w:bottom w:w="40" w:type="dxa"/>
+              <w:left w:w="90" w:type="dxa"/>
+              <w:right w:w="90" w:type="dxa"/>
+            </w:tcMar>
+          </w:tcPr>
+          <w:p>
+            <w:pPr>
+              <w:spacing w:after="60" w:line="271" w:lineRule="auto"/>
+            </w:pPr>
+            <w:r>
+              <w:rPr>
+                <w:b/>
+                <w:sz w:val="18"/>
+              </w:rPr>
+              <w:t>来源</w:t>
+            </w:r>
+          </w:p>
+        </w:tc>
+        <w:tc>
+          <w:tcPr>
+            <w:tcW w:type="dxa" w:w="6633"/>
+            <w:shd w:fill="E4EEE9"/>
+            <w:tcMar>
+              <w:top w:w="40" w:type="dxa"/>
+              <w:bottom w:w="40" w:type="dxa"/>
+              <w:left w:w="90" w:type="dxa"/>
+              <w:right w:w="90" w:type="dxa"/>
+            </w:tcMar>
+          </w:tcPr>
+          <w:p>
+            <w:pPr>
+              <w:spacing w:after="60" w:line="271" w:lineRule="auto"/>
+            </w:pPr>
+            <w:r>
+              <w:rPr>
+                <w:b/>
+                <w:sz w:val="18"/>
+              </w:rPr>
+              <w:t>已存在的能力与本研究定位</w:t>
+            </w:r>
+          </w:p>
+        </w:tc>
+      </w:tr>
+      <w:tr>
+        <w:trPr>
+          <w:cantSplit/>
+        </w:trPr>
+        <w:tc>
+          <w:tcPr>
+            <w:tcW w:type="dxa" w:w="2891"/>
+            <w:shd w:fill="F5F7F4"/>
+            <w:tcMar>
+              <w:top w:w="40" w:type="dxa"/>
+              <w:bottom w:w="40" w:type="dxa"/>
+              <w:left w:w="90" w:type="dxa"/>
+              <w:right w:w="90" w:type="dxa"/>
+            </w:tcMar>
+          </w:tcPr>
+          <w:p>
+            <w:pPr>
+              <w:spacing w:after="60" w:line="271" w:lineRule="auto"/>
+            </w:pPr>
+            <w:r>
+              <w:rPr>
+                <w:b w:val="0"/>
+                <w:sz w:val="18"/>
+              </w:rPr>
+              <w:t>ISO 23247-2 2021 官方范围</w:t>
+            </w:r>
+          </w:p>
+        </w:tc>
+        <w:tc>
+          <w:tcPr>
+            <w:tcW w:type="dxa" w:w="6633"/>
+            <w:shd w:fill="F5F7F4"/>
+            <w:tcMar>
+              <w:top w:w="40" w:type="dxa"/>
+              <w:bottom w:w="40" w:type="dxa"/>
+              <w:left w:w="90" w:type="dxa"/>
+              <w:right w:w="90" w:type="dxa"/>
+            </w:tcMar>
+          </w:tcPr>
+          <w:p>
+            <w:pPr>
+              <w:spacing w:after="60" w:line="271" w:lineRule="auto"/>
+            </w:pPr>
+            <w:r>
+              <w:rPr>
+                <w:b w:val="0"/>
+                <w:sz w:val="18"/>
+              </w:rPr>
+              <w:t>制造数字孪生的实体及功能参考架构。采用架构职责不构成架构原创；本研究需评价其服务责任映射。</w:t>
+            </w:r>
+          </w:p>
+        </w:tc>
+      </w:tr>
+      <w:tr>
+        <w:trPr>
+          <w:cantSplit/>
+        </w:trPr>
+        <w:tc>
+          <w:tcPr>
+            <w:tcW w:type="dxa" w:w="2891"/>
+            <w:shd w:fill="FFFFFF"/>
+            <w:tcMar>
+              <w:top w:w="40" w:type="dxa"/>
+              <w:bottom w:w="40" w:type="dxa"/>
+              <w:left w:w="90" w:type="dxa"/>
+              <w:right w:w="90" w:type="dxa"/>
+            </w:tcMar>
+          </w:tcPr>
+          <w:p>
+            <w:pPr>
+              <w:spacing w:after="60" w:line="271" w:lineRule="auto"/>
+            </w:pPr>
+            <w:r>
+              <w:rPr>
+                <w:b w:val="0"/>
+                <w:sz w:val="18"/>
+              </w:rPr>
+              <w:t>Longo 等 2019 作者摘要</w:t>
+            </w:r>
+          </w:p>
+        </w:tc>
+        <w:tc>
+          <w:tcPr>
+            <w:tcW w:type="dxa" w:w="6633"/>
+            <w:shd w:fill="FFFFFF"/>
+            <w:tcMar>
+              <w:top w:w="40" w:type="dxa"/>
+              <w:bottom w:w="40" w:type="dxa"/>
+              <w:left w:w="90" w:type="dxa"/>
+              <w:right w:w="90" w:type="dxa"/>
+            </w:tcMar>
+          </w:tcPr>
+          <w:p>
+            <w:pPr>
+              <w:spacing w:after="60" w:line="271" w:lineRule="auto"/>
+            </w:pPr>
+            <w:r>
+              <w:rPr>
+                <w:b w:val="0"/>
+                <w:sz w:val="18"/>
+              </w:rPr>
+              <w:t>已有服务导向 DT、ontology 知识结构及两个制造试验场景。因此三者结合不能直接作为原创性主张。</w:t>
+            </w:r>
+          </w:p>
+        </w:tc>
+      </w:tr>
+      <w:tr>
+        <w:trPr>
+          <w:cantSplit/>
+        </w:trPr>
+        <w:tc>
+          <w:tcPr>
+            <w:tcW w:type="dxa" w:w="2891"/>
+            <w:shd w:fill="F5F7F4"/>
+            <w:tcMar>
+              <w:top w:w="40" w:type="dxa"/>
+              <w:bottom w:w="40" w:type="dxa"/>
+              <w:left w:w="90" w:type="dxa"/>
+              <w:right w:w="90" w:type="dxa"/>
+            </w:tcMar>
+          </w:tcPr>
+          <w:p>
+            <w:pPr>
+              <w:spacing w:after="60" w:line="271" w:lineRule="auto"/>
+            </w:pPr>
+            <w:r>
+              <w:rPr>
+                <w:b w:val="0"/>
+                <w:sz w:val="18"/>
+              </w:rPr>
+              <w:t>Nguyen 等 2025 摘要与引言</w:t>
+            </w:r>
+          </w:p>
+        </w:tc>
+        <w:tc>
+          <w:tcPr>
+            <w:tcW w:type="dxa" w:w="6633"/>
+            <w:shd w:fill="F5F7F4"/>
+            <w:tcMar>
+              <w:top w:w="40" w:type="dxa"/>
+              <w:bottom w:w="40" w:type="dxa"/>
+              <w:left w:w="90" w:type="dxa"/>
+              <w:right w:w="90" w:type="dxa"/>
+            </w:tcMar>
+          </w:tcPr>
+          <w:p>
+            <w:pPr>
+              <w:spacing w:after="60" w:line="271" w:lineRule="auto"/>
+            </w:pPr>
+            <w:r>
+              <w:rPr>
+                <w:b w:val="0"/>
+                <w:sz w:val="18"/>
+              </w:rPr>
+              <w:t>已有涡轮叶片维修 ontology 框架；摘要将后续实现与验证列为未来工作。本展示可主张已执行限定查询和对照，但不据此宣布全面领先。</w:t>
+            </w:r>
+          </w:p>
+        </w:tc>
+      </w:tr>
+      <w:tr>
+        <w:trPr>
+          <w:cantSplit/>
+        </w:trPr>
+        <w:tc>
+          <w:tcPr>
+            <w:tcW w:type="dxa" w:w="2891"/>
+            <w:shd w:fill="FFFFFF"/>
+            <w:tcMar>
+              <w:top w:w="40" w:type="dxa"/>
+              <w:bottom w:w="40" w:type="dxa"/>
+              <w:left w:w="90" w:type="dxa"/>
+              <w:right w:w="90" w:type="dxa"/>
+            </w:tcMar>
+          </w:tcPr>
+          <w:p>
+            <w:pPr>
+              <w:spacing w:after="60" w:line="271" w:lineRule="auto"/>
+            </w:pPr>
+            <w:r>
+              <w:rPr>
+                <w:b w:val="0"/>
+                <w:sz w:val="18"/>
+              </w:rPr>
+              <w:t>W3C SHACL 2017 推荐标准</w:t>
+            </w:r>
+          </w:p>
+        </w:tc>
+        <w:tc>
+          <w:tcPr>
+            <w:tcW w:type="dxa" w:w="6633"/>
+            <w:shd w:fill="FFFFFF"/>
+            <w:tcMar>
+              <w:top w:w="40" w:type="dxa"/>
+              <w:bottom w:w="40" w:type="dxa"/>
+              <w:left w:w="90" w:type="dxa"/>
+              <w:right w:w="90" w:type="dxa"/>
+            </w:tcMar>
+          </w:tcPr>
+          <w:p>
+            <w:pPr>
+              <w:spacing w:after="60" w:line="271" w:lineRule="auto"/>
+            </w:pPr>
+            <w:r>
+              <w:rPr>
+                <w:b w:val="0"/>
+                <w:sz w:val="18"/>
+              </w:rPr>
+              <w:t>RDF 约束验证是已存在技术。本研究应解释服务证据要求及应用方法的增量，而不是把 SHACL 本身作为创新。</w:t>
+            </w:r>
+          </w:p>
+        </w:tc>
+      </w:tr>
+    </w:tbl>
+    <w:p>
+      <w:pPr>
+        <w:spacing w:after="0"/>
+      </w:pPr>
+    </w:p>
+    <w:p>
+      <w:hyperlink r:id="rId21">
+        <w:r>
+          <w:rPr>
+            <w:color w:val="17665E"/>
+          </w:rPr>
+          <w:t>ISO 23247-2 官方范围</w:t>
+        </w:r>
+      </w:hyperlink>
+    </w:p>
+    <w:p>
+      <w:hyperlink r:id="rId22">
+        <w:r>
+          <w:rPr>
+            <w:color w:val="17665E"/>
+          </w:rPr>
+          <w:t>Longo 等 服务导向 DT 作者页面</w:t>
+        </w:r>
+      </w:hyperlink>
+    </w:p>
+    <w:p>
+      <w:hyperlink r:id="rId23">
+        <w:r>
+          <w:rPr>
+            <w:color w:val="17665E"/>
+          </w:rPr>
+          <w:t>Nguyen 等 维修 DT 框架</w:t>
+        </w:r>
+      </w:hyperlink>
+    </w:p>
+    <w:p>
+      <w:hyperlink r:id="rId24">
+        <w:r>
+          <w:rPr>
+            <w:color w:val="17665E"/>
+          </w:rPr>
+          <w:t>W3C SHACL 推荐标准</w:t>
+        </w:r>
+      </w:hyperlink>
+    </w:p>
+    <w:p>
+      <w:pPr>
+        <w:pStyle w:val="Heading2"/>
+      </w:pPr>
+      <w:r>
+        <w:t>复审结论与下一步</w:t>
+      </w:r>
+    </w:p>
+    <w:p>
+      <w:r>
+        <w:t>本轮已补充匹配窗口、评分与门槛的机制区分、完整端点区间诊断、组合缺陷回归和有限来源对照。展示可以支持实现可检查性及假设影响的分析；尚不能支持工业效果、完整校准或普遍 ontology 优势。</w:t>
+      </w:r>
+    </w:p>
+    <w:p>
+      <w:r>
+        <w:t>后续优先事项是外部评审提供独立问题和数据、使用新的训练与校准划分并保留未触碰评价集、采集真实服务结果、完成全文级文献对照。现有测试集已用于诊断，不应再称为对本轮设计完全未知的保留集。</w:t>
+      </w:r>
+    </w:p>
+    <w:p>
+      <w:hyperlink r:id="rId25">
+        <w:r>
+          <w:rPr>
+            <w:color w:val="17665E"/>
+          </w:rPr>
+          <w:t>第三轮评价与复审记录</w:t>
+        </w:r>
+      </w:hyperlink>
+    </w:p>
+    <w:p>
+      <w:r>
+        <w:t>建议答辩中先讲服务责任如何进入建议，再按追问打开评价面板。坦诚解释相同对照结果、区间上限和样本边界，比扩大功能主张更有说服力。</w:t>
       </w:r>
     </w:p>
     <w:sectPr>

</xml_diff>